<commit_message>
Seat held ~25 min: eating 14-18 + ~9 min staying at the table
The group observed that the hall is usually full. The simulator now keeps
the seat taken for ~9 min after eating (chatting, waiting for friends), so a
seat is held ~25 min. Serving stays at 2 x 10/min, which keeps the observed
queues. Peak seat use at Central 57% (was 38%), Munch 38% (77% with the
screens); waits unchanged. Both Final_ workbooks rebuilt (the group's edits
kept in the builder), the Final_ doc's seat-time passages updated, README.

Co-Authored-By: Claude Opus 5.5 <noreply@anthropic.com>
Claude-Session: https://claude.ai/code/session_013JwSYm4UV7vKHqaUukbU1G
</commit_message>
<xml_diff>
--- a/docs/Final_MDS_Queuing_Theory_and_Simulation.docx
+++ b/docs/Final_MDS_Queuing_Theory_and_Simulation.docx
@@ -1477,7 +1477,7 @@
                 <w:sz w:val="19"/>
                 <w:szCs w:val="19"/>
               </w:rPr>
-              <w:t>Total capacity is enough, but the load is uneven. In the busiest 10 minutes (13:10, when several departments' lunch breaks overlap) about 37 students/min arrive in all, against 40/min of serving capacity (2 stations × 2 messes × 10/min, μ assumed), so ρ ≈ 0.93 overall. With 80% going to Central by habit (measured: ~2,360 of ~2,960), Central gets ≈ 29/min against 20/min (ρ ≈ 1.46, saturated, and close to its single scanner's ~30/min limit) while Munch gets ≈ 7.5/min against 20/min (ρ ≈ 0.38). Seats are never the constraint: the stations let at most 20 students a minute through, so at most ≈ 320 seats per mess are in use (section 3.2)</w:t>
+              <w:t>Total capacity is enough, but the load is uneven. In the busiest 10 minutes (13:10, when several departments' lunch breaks overlap) about 37 students/min arrive in all, against 40/min of serving capacity (2 stations × 2 messes × 10/min, μ assumed), so ρ ≈ 0.93 overall. With 80% going to Central by habit (measured: ~2,360 of ~2,960), Central gets ≈ 29/min against 20/min (ρ ≈ 1.46, saturated, and close to its single scanner's ~30/min limit) while Munch gets ≈ 7.5/min against 20/min (ρ ≈ 0.38). Seats are not the constraint: the stations let at most 20 students a minute through, so with a seat held ~25 min at most ≈ 500 seats per mess are in use (section 3.2); the hall looks full because the food line stands inside too</w:t>
             </w:r>
           </w:p>
         </w:tc>
@@ -3320,7 +3320,7 @@
                 <w:sz w:val="19"/>
                 <w:szCs w:val="19"/>
               </w:rPr>
-              <w:t xml:space="preserve">Student eats (14–18 min), disposes of the plate (1–2 min) and leaves</w:t>
+              <w:t>Student eats (14–18 min), stays a while (~9 min), disposes of the plate (1–2 min) and leaves</w:t>
             </w:r>
           </w:p>
         </w:tc>
@@ -6135,7 +6135,7 @@
                 <w:sz w:val="19"/>
                 <w:szCs w:val="19"/>
               </w:rPr>
-              <w:t xml:space="preserve">Average time a student spends seated after being served</w:t>
+              <w:t>Average time a student holds a seat (eating, then staying)</w:t>
             </w:r>
           </w:p>
         </w:tc>
@@ -6161,7 +6161,7 @@
                 <w:sz w:val="19"/>
                 <w:szCs w:val="19"/>
               </w:rPr>
-              <w:t xml:space="preserve">14–18 min (mean 16), group estimate</w:t>
+              <w:t>~25 min = eating 14–18 + ~9 staying, group estimate</w:t>
             </w:r>
           </w:p>
         </w:tc>
@@ -6241,7 +6241,7 @@
                 <w:sz w:val="19"/>
                 <w:szCs w:val="19"/>
               </w:rPr>
-              <w:t xml:space="preserve">Students served in the last T_eat minutes (still eating)</w:t>
+              <w:t>Students served in the last T_eat minutes (still at the table)</w:t>
             </w:r>
           </w:p>
         </w:tc>
@@ -7580,7 +7580,7 @@
         <w:spacing w:after="120"/>
       </w:pPr>
       <w:r>
-        <w:t xml:space="preserve">Rearranged, λ_max = N / W gives the highest arrival rate the seats can sustain. A seat is held only while eating (14–18 min, group estimate), so W here is the eating time, not the whole visit:</w:t>
+        <w:t>Rearranged, λ_max = N / W gives the highest arrival rate the seats can sustain. A seat is held while eating (14–18 min) and for a while after it (about 9 min of chatting or waiting for friends), about 25 minutes in all (group estimate), so W here is the seat time, not the whole visit:</w:t>
       </w:r>
     </w:p>
     <w:tbl>
@@ -7688,7 +7688,7 @@
                 <w:sz w:val="19"/>
                 <w:szCs w:val="19"/>
               </w:rPr>
-              <w:t xml:space="preserve">Seat held W (eating, mean)</w:t>
+              <w:t>Seat held W (eating + staying, mean)</w:t>
             </w:r>
           </w:p>
         </w:tc>
@@ -7797,7 +7797,7 @@
                 <w:sz w:val="19"/>
                 <w:szCs w:val="19"/>
               </w:rPr>
-              <w:t xml:space="preserve">16 min</w:t>
+              <w:t>25 min</w:t>
             </w:r>
           </w:p>
         </w:tc>
@@ -7825,7 +7825,7 @@
                 <w:sz w:val="19"/>
                 <w:szCs w:val="19"/>
               </w:rPr>
-              <w:t xml:space="preserve">≈ 56 students/min</w:t>
+              <w:t>≈ 36 students/min</w:t>
             </w:r>
           </w:p>
         </w:tc>
@@ -7905,7 +7905,7 @@
                 <w:sz w:val="19"/>
                 <w:szCs w:val="19"/>
               </w:rPr>
-              <w:t xml:space="preserve">16 min</w:t>
+              <w:t>25 min</w:t>
             </w:r>
           </w:p>
         </w:tc>
@@ -7933,7 +7933,7 @@
                 <w:sz w:val="19"/>
                 <w:szCs w:val="19"/>
               </w:rPr>
-              <w:t xml:space="preserve">≈ 31 students/min</w:t>
+              <w:t>≈ 20 students/min</w:t>
             </w:r>
           </w:p>
         </w:tc>
@@ -8013,7 +8013,7 @@
                 <w:sz w:val="19"/>
                 <w:szCs w:val="19"/>
               </w:rPr>
-              <w:t xml:space="preserve">16 min</w:t>
+              <w:t>25 min</w:t>
             </w:r>
           </w:p>
         </w:tc>
@@ -8039,7 +8039,7 @@
                 <w:sz w:val="19"/>
                 <w:szCs w:val="19"/>
               </w:rPr>
-              <w:t xml:space="preserve">≈ 87/min</w:t>
+              <w:t>≈ 56/min</w:t>
             </w:r>
           </w:p>
         </w:tc>
@@ -8068,7 +8068,7 @@
         <w:pStyle w:val="Heading3"/>
       </w:pPr>
       <w:r>
-        <w:t>Application 2: why the seats never fill (from our stage timings)</w:t>
+        <w:t>Application 2: why the hall looks full but the seats do not run out</w:t>
       </w:r>
     </w:p>
     <w:p>
@@ -8076,7 +8076,7 @@
         <w:spacing w:after="120"/>
       </w:pPr>
       <w:r>
-        <w:t>Little's Law applies to each stage on its own. A seat is used only by a student who has been served, and the serving stations serve at most cμ = 20 students a minute. So, however long the queue, seats in use ≤ 20/min × 16 min of eating ≈ 320 at each mess: about a third of Central's 900 and two-thirds of Munch's 492. The simulation agrees (peak 341 seats in use at Central, 38%). A hall can still look full, as in photo O1 at 13:18, because the people standing in the queue are inside too: L ≈ 29/min × 26 min ≈ 750 people in the hall in all, most of them queueing, not seated. The constraint is the serving stations, not the seats.</w:t>
+        <w:t>Little's Law applies to each stage on its own. A seat is used only by a student who has been served, and the serving stations serve at most cμ = 20 students a minute. So, however long the queue, seats in use ≤ 20/min × 25 min at the table ≈ 500 at each mess: just over half of Central's 900. The simulation agrees (peak 516 seats in use at Central, 57%; 186 of Munch's 492, 38%). The hall looks full, as in photo O1 at 13:18, because over half the seats are taken and the food line stands inside too: at 13:20 more than 100 students are still queueing for food. The constraint is the serving stations, not the seats. One consequence for load balancing: Munch's 492 seats can take about 492 ÷ 25 ≈ 20 students a minute, the same as its stations, so with the screens Munch's seats run about three-quarters full at the peak (378 of 492) and would be the next limit if more students were sent there.</w:t>
       </w:r>
     </w:p>
     <w:p>
@@ -12101,7 +12101,7 @@
                 <w:sz w:val="19"/>
                 <w:szCs w:val="19"/>
               </w:rPr>
-              <w:t xml:space="preserve">900 (Central) and 492 (Munch) seats; if full, the student waits; eating takes 14–18 min (group estimate)</w:t>
+              <w:t>900 (Central) and 492 (Munch) seats; if full, the student waits; eating takes 14–18 min and students stay ~9 min more, so a seat is held ~25 min (group estimate)</w:t>
             </w:r>
           </w:p>
         </w:tc>
@@ -12261,7 +12261,7 @@
                 <w:sz w:val="19"/>
                 <w:szCs w:val="19"/>
               </w:rPr>
-              <w:t xml:space="preserve">Queue wait = time queueing for the scanner, a station and a seat. Throughput = door to leaving (group: 17–35 min). Simulated: ~19.8 min for students who meet no queue, ~25.6 min around today's 13:17 peak</w:t>
+              <w:t>Queue wait = time queueing for the scanner, a station and a seat. Throughput = door to leaving (group: 17–35 min). Simulated: ~28.8 min for students who meet no queue, ~34.6 min around today's 13:17 peak</w:t>
             </w:r>
           </w:p>
         </w:tc>
@@ -13322,7 +13322,7 @@
         <w:t xml:space="preserve">calibrated, not measured</w:t>
       </w:r>
       <w:r>
-        <w:t xml:space="preserve">: with it, the no-screen simulation gives a 20–26 minute visit and a ~14 minute 90th-percentile wait, close to the group's 17–35 minutes and the ~15 minutes seen in Phase 1; a tighter lag (15 ± 10, everyone rushing at the bell) gives ~30-minute peak visits and a 23-minute 90th percentile, above what was observed. The curve has two surges: about </w:t>
+        <w:t xml:space="preserve">: with it, the no-screen simulation gives a 29–35 minute visit and a ~14 minute 90th-percentile wait, close to the group's 17–35 minutes and the ~15 minutes seen in Phase 1; a tighter lag (15 ± 10, everyone rushing at the bell) gives ~41-minute peak visits and a 23-minute 90th percentile, above what was observed. The curve has two surges: about </w:t>
       </w:r>
       <w:r>
         <w:rPr>
@@ -13428,7 +13428,7 @@
           <w:sz w:val="24"/>
           <w:szCs w:val="24"/>
         </w:rPr>
-        <w:t xml:space="preserve">L̂(t) = B(t) + S(t),   where S(t) = students served in the last 19 minutes (rest of food collection + eating + disposal)</w:t>
+        <w:t>L̂(t) = B(t) + S(t),   where S(t) = students served in the last 28 minutes (rest of food collection + time at the table + disposal)</w:t>
       </w:r>
       <w:r>
         <w:rPr>
@@ -13535,7 +13535,7 @@
         <w:t xml:space="preserve">Seat wait</w:t>
       </w:r>
       <w:r>
-        <w:t xml:space="preserve"> = extra people beyond N ÷ seat turnover (N / eating time seats freed per minute). Zero unless the hall is full.</w:t>
+        <w:t xml:space="preserve"> = extra people beyond N ÷ seat turnover (N / seat time seats freed per minute). Zero unless the hall is full.</w:t>
       </w:r>
     </w:p>
     <w:p>
@@ -13614,7 +13614,7 @@
           <w:b w:val="0"/>
           <w:bCs/>
         </w:rPr>
-        <w:t xml:space="preserve"> for someone arriving now = scan and plate + queue wait + serving + food line + eating + disposal. It is about 20 minutes on a normal day (the group's estimate; the stage timings' mid-points add up to ≈ 19.5) and rises during surges. The manager dashboard shows it, next to a 'When students arrive' panel: the arrival curve from the department lunch breaks, the arrivals so far, the 40/min serving capacity of both messes, and which departments are on their break now.</w:t>
+        <w:t xml:space="preserve"> for someone arriving now = scan and plate + queue wait + serving + food line + time at the table + disposal. It is about 29 minutes on a normal day (the stage timings' mid-points: 0.6 + 1.5 + 25 at the table + 1.5 ≈ 28.6) and rises during surges. The manager dashboard shows it, next to a 'When students arrive' panel: the arrival curve from the department lunch breaks, the arrivals so far, the 40/min serving capacity of both messes, and which departments are on their break now.</w:t>
       </w:r>
     </w:p>
     <w:p>
@@ -14122,7 +14122,7 @@
                 <w:sz w:val="19"/>
                 <w:szCs w:val="19"/>
               </w:rPr>
-              <w:t xml:space="preserve">23.9</w:t>
+              <w:t>32.9</w:t>
             </w:r>
           </w:p>
         </w:tc>
@@ -14332,7 +14332,7 @@
                 <w:sz w:val="19"/>
                 <w:szCs w:val="19"/>
               </w:rPr>
-              <w:t xml:space="preserve">20.8</w:t>
+              <w:t>29.8</w:t>
             </w:r>
           </w:p>
         </w:tc>
@@ -14542,7 +14542,7 @@
                 <w:sz w:val="19"/>
                 <w:szCs w:val="19"/>
               </w:rPr>
-              <w:t xml:space="preserve">20.4</w:t>
+              <w:t>29.4</w:t>
             </w:r>
           </w:p>
         </w:tc>
@@ -14752,7 +14752,7 @@
                 <w:sz w:val="19"/>
                 <w:szCs w:val="19"/>
               </w:rPr>
-              <w:t xml:space="preserve">20.4</w:t>
+              <w:t>29.4</w:t>
             </w:r>
           </w:p>
         </w:tc>
@@ -14910,7 +14910,7 @@
         <w:t xml:space="preserve">13.9 to 2.1 minutes</w:t>
       </w:r>
       <w:r>
-        <w:t xml:space="preserve">; throughput falls from 23.9 to 20.4 minutes.</w:t>
+        <w:t>; throughput falls from 32.9 to 29.4 minutes.</w:t>
       </w:r>
     </w:p>
     <w:p>
@@ -14966,7 +14966,7 @@
         <w:spacing w:after="60"/>
       </w:pPr>
       <w:r>
-        <w:t xml:space="preserve">Without screens the simulated 90th-percentile wait (~14 min) is close to the ~15 min observed in Phase 1, and the simulated throughput (~19.8 min with no queue, ~25.6 min at the peak) sits in the group's 17–35 min range. This is partly by construction: the arrival lag was calibrated to it.</w:t>
+        <w:t>Without screens the simulated 90th-percentile wait (~14 min) is close to the ~15 min observed in Phase 1, and the simulated throughput (~28.8 min with no queue, ~34.6 min at the peak) sits at the upper end of the group's 17–35 min range, because students stay at the table after eating. This is partly by construction: the arrival lag was calibrated to it.</w:t>
       </w:r>
     </w:p>
     <w:p>
@@ -17216,7 +17216,7 @@
           <w:b w:val="0"/>
           <w:bCs/>
         </w:rPr>
-        <w:t>: the habit split and the service rate are assumed; department sizes are rough and the arrival lag is calibrated, not measured; the bias explanations are hypotheses; the simulated visit for a student who meets no queue (19.8 min) is a little above the ~18 minutes measured in Phase 1, so the group's stage timings may be slightly long. The biometric logs and a few stopwatch timings settle these (workbook: Data Collection).</w:t>
+        <w:t>: the habit split and the service rate are assumed; department sizes are rough and the arrival lag is calibrated, not measured; the bias explanations are hypotheses; a student who meets no queue now takes about 29 minutes door to door, because a seat is held ~25 minutes (eating plus staying); the ~9 minutes of staying is the group's estimate and should be timed. The biometric logs and a few stopwatch timings settle these (workbook: Data Collection).</w:t>
       </w:r>
     </w:p>
     <w:p>
@@ -23652,7 +23652,7 @@
                 <w:sz w:val="19"/>
                 <w:szCs w:val="19"/>
               </w:rPr>
-              <w:t xml:space="preserve">Eating</w:t>
+              <w:t>Eating, then staying at the table</w:t>
             </w:r>
           </w:p>
         </w:tc>
@@ -23678,7 +23678,7 @@
                 <w:sz w:val="19"/>
                 <w:szCs w:val="19"/>
               </w:rPr>
-              <w:t xml:space="preserve">14–18 min</w:t>
+              <w:t>14–18 min + ~9 min</w:t>
             </w:r>
           </w:p>
         </w:tc>
@@ -27189,7 +27189,7 @@
                 <w:sz w:val="19"/>
                 <w:szCs w:val="19"/>
               </w:rPr>
-              <w:t>docs/Final_Final_Queue_Capacity_LoadBalancing.xlsx: M/M/1 and M/M/c per process, Little's Law per slot, seat turnover, static vs dynamic routing</w:t>
+              <w:t>docs/Final_Queue_Capacity_LoadBalancing.xlsx: M/M/1 and M/M/c per process, Little's Law per slot, seat turnover, static vs dynamic routing</w:t>
             </w:r>
           </w:p>
         </w:tc>
@@ -27362,7 +27362,7 @@
           <w:b w:val="0"/>
           <w:bCs/>
         </w:rPr>
-        <w:t xml:space="preserve"> Seats were compared with everyone inside the hall, queue included. Seats only hold served students, and the stations cap that flow at 20 a minute, so at most ≈ 320 seats per mess are ever in use. Section 3.2 and the OM table now say so.</w:t>
+        <w:t xml:space="preserve"> Seats were compared with everyone inside the hall, queue included. Seats only hold served students, and the stations cap that flow at 20 a minute, so at most ≈ 20 × 25 ≈ 500 seats per mess are ever in use (a seat is held ~25 min: eating plus staying at the table). Section 3.2 and the OM table now say so.</w:t>
       </w:r>
     </w:p>
     <w:p>
@@ -27483,6 +27483,30 @@
           <w:bCs/>
         </w:rPr>
         <w:t xml:space="preserve"> Removed stale numbers from an older model version (a 7.2 → 8.0 minute wait; a 16.7-minute no-queue visit; a 17–18 minute quiet visit).</w:t>
+      </w:r>
+    </w:p>
+    <w:p>
+      <w:pPr>
+        <w:pStyle w:val="ListParagraph"/>
+        <w:numPr>
+          <w:ilvl w:val="0"/>
+          <w:numId w:val="3"/>
+        </w:numPr>
+        <w:spacing w:after="60"/>
+      </w:pPr>
+      <w:r>
+        <w:rPr>
+          <w:b/>
+          <w:bCs/>
+        </w:rPr>
+        <w:t xml:space="preserve">Seat time. </w:t>
+      </w:r>
+      <w:r>
+        <w:rPr>
+          <w:b w:val="0"/>
+          <w:bCs/>
+        </w:rPr>
+        <w:t>The group observed that the hall is usually full, so ~9 minutes of staying at the table after eating (chatting, waiting for friends) was added: a seat is now held ~25 minutes, not 16. Peak seat use at Central rises from 38% to 57%; waits are unchanged, because the serving stations are still the bottleneck.</w:t>
       </w:r>
     </w:p>
     <w:sectPr>

</xml_diff>